<commit_message>
Adicionados e corrigidos alguns fluxos de exceção, correção de sessões #22.
</commit_message>
<xml_diff>
--- a/Requisitos/CSU16 - Manter Endereço.docx
+++ b/Requisitos/CSU16 - Manter Endereço.docx
@@ -18,25 +18,7 @@
           <w:sz w:val="36"/>
           <w:szCs w:val="36"/>
         </w:rPr>
-        <w:t>CSU</w:t>
-      </w:r>
-      <w:r>
-        <w:rPr>
-          <w:b/>
-          <w:color w:val="FF0000"/>
-          <w:sz w:val="36"/>
-          <w:szCs w:val="36"/>
-        </w:rPr>
-        <w:t>16</w:t>
-      </w:r>
-      <w:r>
-        <w:rPr>
-          <w:b/>
-          <w:color w:val="FF0000"/>
-          <w:sz w:val="36"/>
-          <w:szCs w:val="36"/>
-        </w:rPr>
-        <w:t xml:space="preserve">: </w:t>
+        <w:t xml:space="preserve">CSU16: </w:t>
       </w:r>
       <w:r>
         <w:rPr>
@@ -44,15 +26,7 @@
           <w:sz w:val="36"/>
           <w:szCs w:val="36"/>
         </w:rPr>
-        <w:t xml:space="preserve">Manter </w:t>
-      </w:r>
-      <w:r>
-        <w:rPr>
-          <w:b/>
-          <w:sz w:val="36"/>
-          <w:szCs w:val="36"/>
-        </w:rPr>
-        <w:t>Endereço</w:t>
+        <w:t>Manter Endereço</w:t>
       </w:r>
     </w:p>
     <w:p>
@@ -140,13 +114,7 @@
               <w:rPr>
                 <w:b w:val="0"/>
               </w:rPr>
-              <w:t xml:space="preserve">65 </w:t>
-            </w:r>
-            <w:r>
-              <w:rPr>
-                <w:b w:val="0"/>
-              </w:rPr>
-              <w:t>(</w:t>
+              <w:t>65 (</w:t>
             </w:r>
             <w:r>
               <w:t>Risco Baixo e Prioridade Alta)</w:t>
@@ -194,42 +162,7 @@
                 <w:sz w:val="28"/>
                 <w:szCs w:val="28"/>
               </w:rPr>
-              <w:t xml:space="preserve">O Cliente </w:t>
-            </w:r>
-            <w:r>
-              <w:rPr>
-                <w:sz w:val="28"/>
-                <w:szCs w:val="28"/>
-              </w:rPr>
-              <w:t xml:space="preserve">pode </w:t>
-            </w:r>
-            <w:r>
-              <w:rPr>
-                <w:sz w:val="28"/>
-                <w:szCs w:val="28"/>
-              </w:rPr>
-              <w:t xml:space="preserve">alterar, remover ou </w:t>
-            </w:r>
-            <w:r>
-              <w:rPr>
-                <w:sz w:val="28"/>
-                <w:szCs w:val="28"/>
-              </w:rPr>
-              <w:t>cadastrar</w:t>
-            </w:r>
-            <w:r>
-              <w:rPr>
-                <w:sz w:val="28"/>
-                <w:szCs w:val="28"/>
-              </w:rPr>
-              <w:t xml:space="preserve"> os </w:t>
-            </w:r>
-            <w:r>
-              <w:rPr>
-                <w:sz w:val="28"/>
-                <w:szCs w:val="28"/>
-              </w:rPr>
-              <w:t>endereços no sistema</w:t>
+              <w:t>O Cliente pode alterar, remover ou cadastrar os endereços no sistema</w:t>
             </w:r>
           </w:p>
         </w:tc>
@@ -374,31 +307,7 @@
                 <w:szCs w:val="28"/>
               </w:rPr>
               <w:br/>
-              <w:t>CSU01-</w:t>
-            </w:r>
-            <w:r>
-              <w:rPr>
-                <w:color w:val="FF0000"/>
-                <w:sz w:val="28"/>
-                <w:szCs w:val="28"/>
-              </w:rPr>
-              <w:t>Autenticar</w:t>
-            </w:r>
-            <w:r>
-              <w:rPr>
-                <w:color w:val="FF0000"/>
-                <w:sz w:val="28"/>
-                <w:szCs w:val="28"/>
-              </w:rPr>
-              <w:t xml:space="preserve"> </w:t>
-            </w:r>
-            <w:r>
-              <w:rPr>
-                <w:color w:val="FF0000"/>
-                <w:sz w:val="28"/>
-                <w:szCs w:val="28"/>
-              </w:rPr>
-              <w:t>Cliente</w:t>
+              <w:t>CSU01-Autenticar Cliente</w:t>
             </w:r>
             <w:r>
               <w:rPr>
@@ -882,15 +791,7 @@
                 <w:sz w:val="28"/>
                 <w:szCs w:val="28"/>
               </w:rPr>
-              <w:t>Tela_</w:t>
-            </w:r>
-            <w:r>
-              <w:rPr>
-                <w:color w:val="FF0000"/>
-                <w:sz w:val="28"/>
-                <w:szCs w:val="28"/>
-              </w:rPr>
-              <w:t>M2)</w:t>
+              <w:t>Tela_M2)</w:t>
             </w:r>
             <w:r>
               <w:rPr>
@@ -1151,29 +1052,14 @@
                 <w:sz w:val="28"/>
                 <w:szCs w:val="28"/>
               </w:rPr>
-              <w:t xml:space="preserve">Linha </w:t>
-            </w:r>
-            <w:r>
-              <w:rPr>
-                <w:b/>
-                <w:sz w:val="28"/>
-                <w:szCs w:val="28"/>
-              </w:rPr>
-              <w:t>2</w:t>
-            </w:r>
-            <w:r>
-              <w:rPr>
-                <w:sz w:val="28"/>
-                <w:szCs w:val="28"/>
-              </w:rPr>
-              <w:t xml:space="preserve">. </w:t>
-            </w:r>
-            <w:r>
-              <w:rPr>
-                <w:sz w:val="28"/>
-                <w:szCs w:val="28"/>
-              </w:rPr>
-              <w:t>Ator pressiona o botão “Voltar”. Sistema exibe a tela de endereços cadastrados.(</w:t>
+              <w:t>Linha 2</w:t>
+            </w:r>
+            <w:r>
+              <w:rPr>
+                <w:sz w:val="28"/>
+                <w:szCs w:val="28"/>
+              </w:rPr>
+              <w:t>. Ator pressiona o botão “Voltar”. Sistema exibe a tela de endereços cadastrados.(</w:t>
             </w:r>
             <w:r>
               <w:rPr>
@@ -1500,50 +1386,14 @@
                 <w:sz w:val="28"/>
                 <w:szCs w:val="28"/>
               </w:rPr>
-              <w:t xml:space="preserve">Linha </w:t>
-            </w:r>
-            <w:r>
-              <w:rPr>
-                <w:b/>
-                <w:sz w:val="28"/>
-                <w:szCs w:val="28"/>
-              </w:rPr>
-              <w:t>3</w:t>
-            </w:r>
-            <w:r>
-              <w:rPr>
-                <w:sz w:val="28"/>
-                <w:szCs w:val="28"/>
-              </w:rPr>
-              <w:t>:</w:t>
-            </w:r>
-            <w:r>
-              <w:rPr>
-                <w:sz w:val="28"/>
-                <w:szCs w:val="28"/>
-              </w:rPr>
-              <w:t xml:space="preserve"> </w:t>
-            </w:r>
-            <w:r>
-              <w:rPr>
-                <w:sz w:val="28"/>
-                <w:szCs w:val="28"/>
-              </w:rPr>
-              <w:t>Endereço não pode ser excluído</w:t>
-            </w:r>
-            <w:r>
-              <w:rPr>
-                <w:sz w:val="28"/>
-                <w:szCs w:val="28"/>
-              </w:rPr>
-              <w:t xml:space="preserve">. </w:t>
-            </w:r>
-            <w:r>
-              <w:rPr>
-                <w:sz w:val="28"/>
-                <w:szCs w:val="28"/>
-              </w:rPr>
-              <w:t xml:space="preserve">Sistema exibe a mensagem “O endereço não pode ser excluído, você só possui este endereço.”. Retorna ao Passo 2 da </w:t>
+              <w:t>Linha 3</w:t>
+            </w:r>
+            <w:r>
+              <w:rPr>
+                <w:sz w:val="28"/>
+                <w:szCs w:val="28"/>
+              </w:rPr>
+              <w:t xml:space="preserve">: Endereço não pode ser excluído. Sistema exibe a mensagem “O endereço não pode ser excluído, você só possui este endereço.”. Retorna ao Passo 2 da </w:t>
             </w:r>
             <w:r>
               <w:rPr>
@@ -1584,15 +1434,7 @@
                 <w:sz w:val="28"/>
                 <w:szCs w:val="28"/>
               </w:rPr>
-              <w:t>Fluxo Alter</w:t>
-            </w:r>
-            <w:r>
-              <w:rPr>
-                <w:b/>
-                <w:sz w:val="28"/>
-                <w:szCs w:val="28"/>
-              </w:rPr>
-              <w:t>nativo</w:t>
+              <w:t>Fluxo Alternativo</w:t>
             </w:r>
           </w:p>
         </w:tc>
@@ -1653,7 +1495,14 @@
                 <w:sz w:val="28"/>
                 <w:szCs w:val="28"/>
               </w:rPr>
-              <w:t>tela de endereços.(</w:t>
+              <w:t xml:space="preserve">tela de </w:t>
+            </w:r>
+            <w:r>
+              <w:rPr>
+                <w:sz w:val="28"/>
+                <w:szCs w:val="28"/>
+              </w:rPr>
+              <w:t>endereços. (</w:t>
             </w:r>
             <w:r>
               <w:rPr>
@@ -1669,6 +1518,13 @@
                 <w:szCs w:val="28"/>
               </w:rPr>
               <w:t>)</w:t>
+            </w:r>
+            <w:r>
+              <w:rPr>
+                <w:sz w:val="28"/>
+                <w:szCs w:val="28"/>
+              </w:rPr>
+              <w:t>.</w:t>
             </w:r>
           </w:p>
         </w:tc>
@@ -1848,7 +1704,7 @@
                 <w:sz w:val="28"/>
                 <w:szCs w:val="28"/>
               </w:rPr>
-              <w:t>endereço(</w:t>
+              <w:t>endereço (</w:t>
             </w:r>
             <w:r>
               <w:rPr>
@@ -1863,7 +1719,14 @@
                 <w:sz w:val="28"/>
                 <w:szCs w:val="28"/>
               </w:rPr>
-              <w:t xml:space="preserve">) </w:t>
+              <w:t>)</w:t>
+            </w:r>
+            <w:r>
+              <w:rPr>
+                <w:sz w:val="28"/>
+                <w:szCs w:val="28"/>
+              </w:rPr>
+              <w:t>.</w:t>
             </w:r>
           </w:p>
           <w:p>
@@ -2003,6 +1866,117 @@
                 <w:szCs w:val="28"/>
               </w:rPr>
               <w:t>)</w:t>
+            </w:r>
+            <w:r>
+              <w:rPr>
+                <w:sz w:val="28"/>
+                <w:szCs w:val="28"/>
+              </w:rPr>
+              <w:t>.</w:t>
+            </w:r>
+          </w:p>
+        </w:tc>
+      </w:tr>
+      <w:tr>
+        <w:trPr>
+          <w:trHeight w:val="492"/>
+        </w:trPr>
+        <w:tc>
+          <w:tcPr>
+            <w:tcW w:w="10375" w:type="dxa"/>
+            <w:gridSpan w:val="2"/>
+            <w:tcBorders>
+              <w:top w:val="single" w:sz="4" w:space="0" w:color="000000"/>
+              <w:left w:val="single" w:sz="4" w:space="0" w:color="000000"/>
+              <w:bottom w:val="single" w:sz="4" w:space="0" w:color="000000"/>
+              <w:right w:val="single" w:sz="4" w:space="0" w:color="000000"/>
+            </w:tcBorders>
+            <w:shd w:val="clear" w:color="auto" w:fill="auto"/>
+          </w:tcPr>
+          <w:p>
+            <w:pPr>
+              <w:tabs>
+                <w:tab w:val="left" w:pos="360"/>
+              </w:tabs>
+              <w:spacing w:before="240" w:after="240"/>
+              <w:jc w:val="center"/>
+              <w:rPr>
+                <w:b/>
+                <w:sz w:val="28"/>
+                <w:szCs w:val="28"/>
+              </w:rPr>
+            </w:pPr>
+            <w:r>
+              <w:rPr>
+                <w:b/>
+                <w:sz w:val="28"/>
+                <w:szCs w:val="28"/>
+              </w:rPr>
+              <w:t>Fluxo de Exceção</w:t>
+            </w:r>
+          </w:p>
+        </w:tc>
+      </w:tr>
+      <w:tr>
+        <w:trPr>
+          <w:trHeight w:val="351"/>
+        </w:trPr>
+        <w:tc>
+          <w:tcPr>
+            <w:tcW w:w="10375" w:type="dxa"/>
+            <w:gridSpan w:val="2"/>
+            <w:tcBorders>
+              <w:top w:val="single" w:sz="4" w:space="0" w:color="000000"/>
+              <w:left w:val="single" w:sz="4" w:space="0" w:color="000000"/>
+              <w:bottom w:val="single" w:sz="4" w:space="0" w:color="000000"/>
+              <w:right w:val="single" w:sz="4" w:space="0" w:color="000000"/>
+            </w:tcBorders>
+            <w:shd w:val="clear" w:color="auto" w:fill="auto"/>
+          </w:tcPr>
+          <w:p>
+            <w:pPr>
+              <w:tabs>
+                <w:tab w:val="left" w:pos="360"/>
+              </w:tabs>
+              <w:spacing w:before="240" w:after="240"/>
+              <w:jc w:val="both"/>
+              <w:rPr>
+                <w:bCs/>
+                <w:sz w:val="28"/>
+                <w:szCs w:val="28"/>
+              </w:rPr>
+            </w:pPr>
+            <w:r>
+              <w:rPr>
+                <w:b/>
+                <w:sz w:val="28"/>
+                <w:szCs w:val="28"/>
+              </w:rPr>
+              <w:t xml:space="preserve">Linha 3: </w:t>
+            </w:r>
+            <w:r>
+              <w:rPr>
+                <w:bCs/>
+                <w:sz w:val="28"/>
+                <w:szCs w:val="28"/>
+              </w:rPr>
+              <w:t>Sistema não consegue gravar os dados em meio persistente, exibindo a mensagem “Não foi possível cadastrar o endereço, tente novamente!”. Retorna</w:t>
+            </w:r>
+            <w:r>
+              <w:rPr>
+                <w:bCs/>
+                <w:sz w:val="28"/>
+                <w:szCs w:val="28"/>
+              </w:rPr>
+              <w:t xml:space="preserve"> </w:t>
+            </w:r>
+            <w:r>
+              <w:rPr>
+                <w:bCs/>
+                <w:sz w:val="28"/>
+                <w:szCs w:val="28"/>
+              </w:rPr>
+              <w:t>ao passo 1.</w:t>
             </w:r>
           </w:p>
         </w:tc>
@@ -2069,6 +2043,7 @@
               <w:jc w:val="center"/>
             </w:pPr>
             <w:r>
+              <w:lastRenderedPageBreak/>
               <w:t>Data</w:t>
             </w:r>
           </w:p>
@@ -2131,13 +2106,7 @@
               <w:jc w:val="center"/>
             </w:pPr>
             <w:r>
-              <w:t>2</w:t>
-            </w:r>
-            <w:r>
-              <w:t>9</w:t>
-            </w:r>
-            <w:r>
-              <w:t>/08/2025</w:t>
+              <w:t>29/08/2025</w:t>
             </w:r>
           </w:p>
         </w:tc>
@@ -2245,6 +2214,68 @@
             </w:pPr>
             <w:r>
               <w:t>Criação de Fluxo de Exceção</w:t>
+            </w:r>
+          </w:p>
+        </w:tc>
+      </w:tr>
+      <w:tr>
+        <w:tc>
+          <w:tcPr>
+            <w:tcW w:w="2628" w:type="dxa"/>
+            <w:tcBorders>
+              <w:top w:val="single" w:sz="4" w:space="0" w:color="000000"/>
+              <w:left w:val="single" w:sz="4" w:space="0" w:color="000000"/>
+              <w:bottom w:val="single" w:sz="4" w:space="0" w:color="000000"/>
+              <w:right w:val="single" w:sz="4" w:space="0" w:color="000000"/>
+            </w:tcBorders>
+            <w:shd w:val="clear" w:color="auto" w:fill="auto"/>
+          </w:tcPr>
+          <w:p>
+            <w:pPr>
+              <w:jc w:val="center"/>
+            </w:pPr>
+            <w:r>
+              <w:t>07/11/2025</w:t>
+            </w:r>
+          </w:p>
+        </w:tc>
+        <w:tc>
+          <w:tcPr>
+            <w:tcW w:w="1800" w:type="dxa"/>
+            <w:tcBorders>
+              <w:top w:val="single" w:sz="4" w:space="0" w:color="000000"/>
+              <w:left w:val="single" w:sz="4" w:space="0" w:color="000000"/>
+              <w:bottom w:val="single" w:sz="4" w:space="0" w:color="000000"/>
+              <w:right w:val="single" w:sz="4" w:space="0" w:color="000000"/>
+            </w:tcBorders>
+            <w:shd w:val="clear" w:color="auto" w:fill="auto"/>
+          </w:tcPr>
+          <w:p>
+            <w:pPr>
+              <w:jc w:val="center"/>
+            </w:pPr>
+            <w:r>
+              <w:t>Leandro Carvalho</w:t>
+            </w:r>
+          </w:p>
+        </w:tc>
+        <w:tc>
+          <w:tcPr>
+            <w:tcW w:w="6120" w:type="dxa"/>
+            <w:tcBorders>
+              <w:top w:val="single" w:sz="4" w:space="0" w:color="000000"/>
+              <w:left w:val="single" w:sz="4" w:space="0" w:color="000000"/>
+              <w:bottom w:val="single" w:sz="4" w:space="0" w:color="000000"/>
+              <w:right w:val="single" w:sz="4" w:space="0" w:color="000000"/>
+            </w:tcBorders>
+            <w:shd w:val="clear" w:color="auto" w:fill="auto"/>
+          </w:tcPr>
+          <w:p>
+            <w:pPr>
+              <w:jc w:val="center"/>
+            </w:pPr>
+            <w:r>
+              <w:t>Ajuste em Fluxo de Exceção</w:t>
             </w:r>
             <w:bookmarkStart w:id="1" w:name="_GoBack"/>
             <w:bookmarkEnd w:id="1"/>
@@ -3495,7 +3526,7 @@
     <w:basedOn w:val="Normal"/>
     <w:pPr>
       <w:spacing w:line="1" w:lineRule="atLeast"/>
-      <w:ind w:leftChars="-1" w:left="284" w:hangingChars="1"/>
+      <w:ind w:leftChars="-1" w:left="284" w:hangingChars="1" w:hanging="1"/>
       <w:textDirection w:val="btLr"/>
       <w:textAlignment w:val="top"/>
       <w:outlineLvl w:val="0"/>
@@ -3541,9 +3572,7 @@
       <w:tblStyleRowBandSize w:val="1"/>
       <w:tblStyleColBandSize w:val="1"/>
       <w:tblCellMar>
-        <w:top w:w="0" w:type="dxa"/>
         <w:left w:w="70" w:type="dxa"/>
-        <w:bottom w:w="0" w:type="dxa"/>
         <w:right w:w="70" w:type="dxa"/>
       </w:tblCellMar>
     </w:tblPr>
@@ -3554,9 +3583,7 @@
       <w:tblStyleRowBandSize w:val="1"/>
       <w:tblStyleColBandSize w:val="1"/>
       <w:tblCellMar>
-        <w:top w:w="0" w:type="dxa"/>
         <w:left w:w="70" w:type="dxa"/>
-        <w:bottom w:w="0" w:type="dxa"/>
         <w:right w:w="70" w:type="dxa"/>
       </w:tblCellMar>
     </w:tblPr>
@@ -3567,9 +3594,7 @@
       <w:tblStyleRowBandSize w:val="1"/>
       <w:tblStyleColBandSize w:val="1"/>
       <w:tblCellMar>
-        <w:top w:w="0" w:type="dxa"/>
         <w:left w:w="70" w:type="dxa"/>
-        <w:bottom w:w="0" w:type="dxa"/>
         <w:right w:w="70" w:type="dxa"/>
       </w:tblCellMar>
     </w:tblPr>
@@ -3580,9 +3605,7 @@
       <w:tblStyleRowBandSize w:val="1"/>
       <w:tblStyleColBandSize w:val="1"/>
       <w:tblCellMar>
-        <w:top w:w="0" w:type="dxa"/>
         <w:left w:w="70" w:type="dxa"/>
-        <w:bottom w:w="0" w:type="dxa"/>
         <w:right w:w="70" w:type="dxa"/>
       </w:tblCellMar>
     </w:tblPr>
@@ -3593,9 +3616,7 @@
       <w:tblStyleRowBandSize w:val="1"/>
       <w:tblStyleColBandSize w:val="1"/>
       <w:tblCellMar>
-        <w:top w:w="0" w:type="dxa"/>
         <w:left w:w="70" w:type="dxa"/>
-        <w:bottom w:w="0" w:type="dxa"/>
         <w:right w:w="70" w:type="dxa"/>
       </w:tblCellMar>
     </w:tblPr>
@@ -3606,9 +3627,7 @@
       <w:tblStyleRowBandSize w:val="1"/>
       <w:tblStyleColBandSize w:val="1"/>
       <w:tblCellMar>
-        <w:top w:w="0" w:type="dxa"/>
         <w:left w:w="108" w:type="dxa"/>
-        <w:bottom w:w="0" w:type="dxa"/>
         <w:right w:w="108" w:type="dxa"/>
       </w:tblCellMar>
     </w:tblPr>
@@ -3638,9 +3657,7 @@
       <w:tblStyleRowBandSize w:val="1"/>
       <w:tblStyleColBandSize w:val="1"/>
       <w:tblCellMar>
-        <w:top w:w="0" w:type="dxa"/>
         <w:left w:w="70" w:type="dxa"/>
-        <w:bottom w:w="0" w:type="dxa"/>
         <w:right w:w="70" w:type="dxa"/>
       </w:tblCellMar>
     </w:tblPr>
@@ -3651,9 +3668,7 @@
       <w:tblStyleRowBandSize w:val="1"/>
       <w:tblStyleColBandSize w:val="1"/>
       <w:tblCellMar>
-        <w:top w:w="0" w:type="dxa"/>
         <w:left w:w="70" w:type="dxa"/>
-        <w:bottom w:w="0" w:type="dxa"/>
         <w:right w:w="70" w:type="dxa"/>
       </w:tblCellMar>
     </w:tblPr>
@@ -3664,9 +3679,7 @@
       <w:tblStyleRowBandSize w:val="1"/>
       <w:tblStyleColBandSize w:val="1"/>
       <w:tblCellMar>
-        <w:top w:w="0" w:type="dxa"/>
         <w:left w:w="70" w:type="dxa"/>
-        <w:bottom w:w="0" w:type="dxa"/>
         <w:right w:w="70" w:type="dxa"/>
       </w:tblCellMar>
     </w:tblPr>
@@ -3677,9 +3690,7 @@
       <w:tblStyleRowBandSize w:val="1"/>
       <w:tblStyleColBandSize w:val="1"/>
       <w:tblCellMar>
-        <w:top w:w="0" w:type="dxa"/>
         <w:left w:w="70" w:type="dxa"/>
-        <w:bottom w:w="0" w:type="dxa"/>
         <w:right w:w="70" w:type="dxa"/>
       </w:tblCellMar>
     </w:tblPr>
@@ -3690,9 +3701,7 @@
       <w:tblStyleRowBandSize w:val="1"/>
       <w:tblStyleColBandSize w:val="1"/>
       <w:tblCellMar>
-        <w:top w:w="0" w:type="dxa"/>
         <w:left w:w="108" w:type="dxa"/>
-        <w:bottom w:w="0" w:type="dxa"/>
         <w:right w:w="108" w:type="dxa"/>
       </w:tblCellMar>
     </w:tblPr>

</xml_diff>